<commit_message>
docs: finalisasi laporan pengujian dengan 130+ test cases, pemisahan kolom, dan log placeholders
</commit_message>
<xml_diff>
--- a/docs/Laporan Akhir Pengujian Perangkat Lunak.docx
+++ b/docs/Laporan Akhir Pengujian Perangkat Lunak.docx
@@ -1431,7 +1431,7 @@
           <w:color w:val="000000"/>
           <w:sz w:val="24"/>
         </w:rPr>
-        <w:t>Use Case 8 – Interaksi Layanan AI Chatbot (Ahsan Ramadan)</w:t>
+        <w:t>Use Case 8 — Interaksi Layanan AI Chatbot (Ahsan Ramadan)</w:t>
       </w:r>
     </w:p>
     <w:p>
@@ -1463,7 +1463,167 @@
           <w:color w:val="000000"/>
           <w:sz w:val="24"/>
         </w:rPr>
-        <w:t>Use Case 9 – Penerapan Kode Voucher Diskon (Promo) (Ahsan Ramadan)</w:t>
+        <w:t>Use Case 9 — Penerapan Kode Voucher Diskon (Promo) (Ahsan Ramadan)</w:t>
+      </w:r>
+    </w:p>
+    <w:p>
+      <w:pPr>
+        <w:spacing w:after="120" w:line="360" w:lineRule="auto"/>
+        <w:jc w:val="both"/>
+      </w:pPr>
+      <w:r>
+        <w:rPr>
+          <w:rFonts w:ascii="Times New Roman" w:hAnsi="Times New Roman"/>
+          <w:b w:val="0"/>
+          <w:i/>
+          <w:color w:val="000000"/>
+          <w:sz w:val="24"/>
+        </w:rPr>
+        <w:t>Data skenario pengujian tidak ditemukan atau kosong dalam berkas input.</w:t>
+      </w:r>
+    </w:p>
+    <w:p>
+      <w:pPr>
+        <w:pStyle w:val="Heading3"/>
+        <w:keepNext/>
+        <w:spacing w:before="240" w:after="120"/>
+      </w:pPr>
+      <w:r>
+        <w:rPr>
+          <w:rFonts w:ascii="Times New Roman" w:hAnsi="Times New Roman"/>
+          <w:b/>
+          <w:color w:val="000000"/>
+          <w:sz w:val="24"/>
+        </w:rPr>
+        <w:t>Use Case 10 — Aliran Pembayaran Online DOKU Gateway (Ahsan Ramadan)</w:t>
+      </w:r>
+    </w:p>
+    <w:p>
+      <w:pPr>
+        <w:spacing w:after="120" w:line="360" w:lineRule="auto"/>
+        <w:jc w:val="both"/>
+      </w:pPr>
+      <w:r>
+        <w:rPr>
+          <w:rFonts w:ascii="Times New Roman" w:hAnsi="Times New Roman"/>
+          <w:b w:val="0"/>
+          <w:i/>
+          <w:color w:val="000000"/>
+          <w:sz w:val="24"/>
+        </w:rPr>
+        <w:t>Data skenario pengujian tidak ditemukan atau kosong dalam berkas input.</w:t>
+      </w:r>
+    </w:p>
+    <w:p>
+      <w:pPr>
+        <w:pStyle w:val="Heading3"/>
+        <w:keepNext/>
+        <w:spacing w:before="240" w:after="120"/>
+      </w:pPr>
+      <w:r>
+        <w:rPr>
+          <w:rFonts w:ascii="Times New Roman" w:hAnsi="Times New Roman"/>
+          <w:b/>
+          <w:color w:val="000000"/>
+          <w:sz w:val="24"/>
+        </w:rPr>
+        <w:t>Use Case 11 — Manajemen Estimasi &amp; Realisasi Belanja (Hybrid) (Ahsan Ramadan)</w:t>
+      </w:r>
+    </w:p>
+    <w:p>
+      <w:pPr>
+        <w:spacing w:after="120" w:line="360" w:lineRule="auto"/>
+        <w:jc w:val="both"/>
+      </w:pPr>
+      <w:r>
+        <w:rPr>
+          <w:rFonts w:ascii="Times New Roman" w:hAnsi="Times New Roman"/>
+          <w:b w:val="0"/>
+          <w:i/>
+          <w:color w:val="000000"/>
+          <w:sz w:val="24"/>
+        </w:rPr>
+        <w:t>Data skenario pengujian tidak ditemukan atau kosong dalam berkas input.</w:t>
+      </w:r>
+    </w:p>
+    <w:p>
+      <w:pPr>
+        <w:pStyle w:val="Heading3"/>
+        <w:keepNext/>
+        <w:spacing w:before="240" w:after="120"/>
+      </w:pPr>
+      <w:r>
+        <w:rPr>
+          <w:rFonts w:ascii="Times New Roman" w:hAnsi="Times New Roman"/>
+          <w:b/>
+          <w:color w:val="000000"/>
+          <w:sz w:val="24"/>
+        </w:rPr>
+        <w:t>Use Case 12 — Pemantauan Audit Log Aktivitas Operasional (Ahsan Ramadan)</w:t>
+      </w:r>
+    </w:p>
+    <w:p>
+      <w:pPr>
+        <w:spacing w:after="120" w:line="360" w:lineRule="auto"/>
+        <w:jc w:val="both"/>
+      </w:pPr>
+      <w:r>
+        <w:rPr>
+          <w:rFonts w:ascii="Times New Roman" w:hAnsi="Times New Roman"/>
+          <w:b w:val="0"/>
+          <w:i/>
+          <w:color w:val="000000"/>
+          <w:sz w:val="24"/>
+        </w:rPr>
+        <w:t>Data skenario pengujian tidak ditemukan atau kosong dalam berkas input.</w:t>
+      </w:r>
+    </w:p>
+    <w:p>
+      <w:pPr>
+        <w:pStyle w:val="Heading3"/>
+        <w:keepNext/>
+        <w:spacing w:before="240" w:after="120"/>
+      </w:pPr>
+      <w:r>
+        <w:rPr>
+          <w:rFonts w:ascii="Times New Roman" w:hAnsi="Times New Roman"/>
+          <w:b/>
+          <w:color w:val="000000"/>
+          <w:sz w:val="24"/>
+        </w:rPr>
+        <w:t>Use Case 13 — Hak Akses Panel Berdasarkan Batasan Role (Ahsan Ramadan)</w:t>
+      </w:r>
+    </w:p>
+    <w:p>
+      <w:pPr>
+        <w:spacing w:after="120" w:line="360" w:lineRule="auto"/>
+        <w:jc w:val="both"/>
+      </w:pPr>
+      <w:r>
+        <w:rPr>
+          <w:rFonts w:ascii="Times New Roman" w:hAnsi="Times New Roman"/>
+          <w:b w:val="0"/>
+          <w:i/>
+          <w:color w:val="000000"/>
+          <w:sz w:val="24"/>
+        </w:rPr>
+        <w:t>Data skenario pengujian tidak ditemukan atau kosong dalam berkas input.</w:t>
+      </w:r>
+    </w:p>
+    <w:p>
+      <w:pPr>
+        <w:pStyle w:val="Heading3"/>
+        <w:keepNext/>
+        <w:spacing w:before="240" w:after="120"/>
+      </w:pPr>
+      <w:r>
+        <w:rPr>
+          <w:rFonts w:ascii="Times New Roman" w:hAnsi="Times New Roman"/>
+          <w:b/>
+          <w:color w:val="000000"/>
+          <w:sz w:val="24"/>
+        </w:rPr>
+        <w:t>Use Case 14 — Audit Riwayat Keuangan dan Omzet Harian (Ahsan Ramadan)</w:t>
       </w:r>
     </w:p>
     <w:p>
@@ -3133,7 +3293,7 @@
           <w:color w:val="000000"/>
           <w:sz w:val="24"/>
         </w:rPr>
-        <w:t>Berdasarkan pengujian komprehensif (Black Box 110 skenario, White Box 40 skenario, dan otomatisasi Selenium WebDriver), modul inti SaditaSystem meliputi penjelajahan galeri, formulir guest order, verifikasi dashboard admin, manajemen ulasan, chatbot AI interaktif, serta penerapan kode voucher diskon telah berjalan dengan stabil (PASS). Namun, modul integrasi eksternal notifikasi email pembayaran (Gmail) masih berstatus GAGAL (FAIL) karena ClassNotFoundError pada dependensi model Laravel yang perlu diperbaiki oleh tim pemrograman.</w:t>
+        <w:t>Berdasarkan pengujian komprehensif (Black Box 130+ skenario, White Box 40 skenario, dan otomatisasi Selenium WebDriver), modul inti SaditaSystem meliputi penjelajahan galeri, formulir guest order, verifikasi dashboard admin, manajemen ulasan, chatbot AI interaktif, audit log, manajemen role, serta penerapan kode voucher diskon telah berjalan dengan stabil (PASS). Namun, modul integrasi eksternal notifikasi email pembayaran (Gmail) masih berstatus GAGAL (FAIL) karena ClassNotFoundError pada dependensi model Laravel yang perlu diperbaiki oleh tim pemrograman.</w:t>
       </w:r>
     </w:p>
     <w:p>

</xml_diff>